<commit_message>
Additional testing and documentation update for Agentic Supervision module.
</commit_message>
<xml_diff>
--- a/doc/JAI_Whitepaper.docx
+++ b/doc/JAI_Whitepaper.docx
@@ -3269,7 +3269,7 @@
           <w:b w:val="0"/>
           <w:i w:val="0"/>
         </w:rPr>
-        <w:t>Everything JavAI adds to Java is organized into six extension areas. Each is independently understandable, each is delivered as its own Phase 0 library component (§9.1), and — per §2.1's guiding philosophy — each is independently a candidate for upstream proposal if it earns that on its own merits. None of them retrofit sealed JDK classes (Object, java.util.Collection, etc.) from outside, which would require forking the JDK; every primitive is either synthesized into user classes by javaic/the weaver at build time, or shipped as a new, parallel type users opt into explicitly. The six areas are not independent silos, though — §5.8 lays out how they depend on each other, and §5.9 sketches areas that didn't make this document's initial scope.</w:t>
+        <w:t>Everything JavAI adds to Java is organized into seven extension areas. Each is independently understandable, each is delivered as its own Phase 0 library component (§9.1), and — per §2.1's guiding philosophy — each is independently a candidate for upstream proposal if it earns that on its own merits. None of them retrofit sealed JDK classes (Object, java.util.Collection, etc.) from outside, which would require forking the JDK; every primitive is either synthesized into user classes by javaic/the weaver at build time, or shipped as a new, parallel type users opt into explicitly. The seven areas are not independent silos, though — §5.9 lays out how they depend on each other, and §5.10 sketches areas that didn't make this document's initial scope.</w:t>
       </w:r>
     </w:p>
     <w:p>
@@ -14840,7 +14840,7 @@
         <w:pStyle w:val="Heading2"/>
       </w:pPr>
       <w:r>
-        <w:t>5.7 Existing Projects: Depend On, Don't Fork</w:t>
+        <w:t>5.7 Agentic Supervision — AoP Interception with Sync and Async Listeners</w:t>
       </w:r>
     </w:p>
     <w:p>
@@ -14852,7 +14852,1073 @@
           <w:b w:val="0"/>
           <w:i w:val="0"/>
         </w:rPr>
-        <w:t>A posture that cuts across all six areas above, not one of them individually: consistent with the preference to avoid forking, none of the following are proposed for forking. Each is an ordinary library/build dependency:</w:t>
+        <w:t>A classical stack machine is a program, a stack, and a heap the stack points into. Vector Core and Vector Collections (§5.1, §5.4) already turn the heap into a vectorized, queryable object graph; AoP-style interception already means something happens when a stack frame is pushed or popped — a call, a return, a throw. Agentic Supervision wires those two things together at the join point: a method or constructor, once annotated, can be observed and optionally intervened on by a registered listener — including one whose decision is made by an LLM grounded in RAG over the object graph. Nothing about that needs a new kind of primitive; it is a fourth architectural component, alongside program/stack/heap, wired from two things this document already specifies.</w:t>
+      </w:r>
+    </w:p>
+    <w:p>
+      <w:pPr>
+        <w:spacing w:after="160"/>
+      </w:pPr>
+      <w:r>
+        <w:rPr>
+          <w:b w:val="0"/>
+          <w:i w:val="0"/>
+        </w:rPr>
+        <w:t>Prior art: the mechanism is a from-scratch reimplementation, on ByteBuddy, of an ASM-based AoP framework from an earlier project — six pointcuts (CONSTRUCTOR_PRE/POST/EXCEPTION, METHOD_PRE/POST/EXCEPTION), a pub/sub Advisor/PointcutEventHandler model, class-level opt-in with a per-method opt-out. This area keeps the pub/sub model and real read-write access at each join point, but collapses six pointcuts to three — a constructor is just another java.lang.reflect.Executable, which one fired is already recoverable from the event itself — and adds an axis the original never had: every pointcut can be woven for synchronous delivery (blocking, read-write) or asynchronous delivery (fire-and-forget, observation-only), independently, on the same method.</w:t>
+      </w:r>
+    </w:p>
+    <w:tbl>
+      <w:tblPr>
+        <w:tblW w:type="auto" w:w="0"/>
+        <w:jc w:val="center"/>
+        <w:tblLayout w:type="fixed"/>
+        <w:tblLook w:firstColumn="1" w:firstRow="1" w:lastColumn="0" w:lastRow="0" w:noHBand="0" w:noVBand="1" w:val="04A0"/>
+      </w:tblPr>
+      <w:tblGrid>
+        <w:gridCol w:w="2800"/>
+        <w:gridCol w:w="2200"/>
+        <w:gridCol w:w="4360"/>
+      </w:tblGrid>
+      <w:tr>
+        <w:tc>
+          <w:tcPr>
+            <w:tcW w:type="dxa" w:w="2800"/>
+            <w:shd w:val="clear" w:color="auto" w:fill="2E5C8A"/>
+            <w:tcMar>
+              <w:top w:w="80" w:type="dxa"/>
+              <w:left w:w="80" w:type="dxa"/>
+              <w:bottom w:w="80" w:type="dxa"/>
+              <w:right w:w="80" w:type="dxa"/>
+            </w:tcMar>
+          </w:tcPr>
+          <w:p>
+            <w:r/>
+            <w:r>
+              <w:rPr>
+                <w:b/>
+                <w:color w:val="FFFFFF"/>
+                <w:sz w:val="20"/>
+              </w:rPr>
+              <w:t>Element</w:t>
+            </w:r>
+          </w:p>
+        </w:tc>
+        <w:tc>
+          <w:tcPr>
+            <w:tcW w:type="dxa" w:w="2200"/>
+            <w:shd w:val="clear" w:color="auto" w:fill="2E5C8A"/>
+            <w:tcMar>
+              <w:top w:w="80" w:type="dxa"/>
+              <w:left w:w="80" w:type="dxa"/>
+              <w:bottom w:w="80" w:type="dxa"/>
+              <w:right w:w="80" w:type="dxa"/>
+            </w:tcMar>
+          </w:tcPr>
+          <w:p>
+            <w:r/>
+            <w:r>
+              <w:rPr>
+                <w:b/>
+                <w:color w:val="FFFFFF"/>
+                <w:sz w:val="20"/>
+              </w:rPr>
+              <w:t>Kind</w:t>
+            </w:r>
+          </w:p>
+        </w:tc>
+        <w:tc>
+          <w:tcPr>
+            <w:tcW w:type="dxa" w:w="4360"/>
+            <w:shd w:val="clear" w:color="auto" w:fill="2E5C8A"/>
+            <w:tcMar>
+              <w:top w:w="80" w:type="dxa"/>
+              <w:left w:w="80" w:type="dxa"/>
+              <w:bottom w:w="80" w:type="dxa"/>
+              <w:right w:w="80" w:type="dxa"/>
+            </w:tcMar>
+          </w:tcPr>
+          <w:p>
+            <w:r/>
+            <w:r>
+              <w:rPr>
+                <w:b/>
+                <w:color w:val="FFFFFF"/>
+                <w:sz w:val="20"/>
+              </w:rPr>
+              <w:t>Purpose</w:t>
+            </w:r>
+          </w:p>
+        </w:tc>
+      </w:tr>
+      <w:tr>
+        <w:tc>
+          <w:tcPr>
+            <w:tcW w:type="dxa" w:w="2800"/>
+            <w:tcMar>
+              <w:top w:w="80" w:type="dxa"/>
+              <w:left w:w="80" w:type="dxa"/>
+              <w:bottom w:w="80" w:type="dxa"/>
+              <w:right w:w="80" w:type="dxa"/>
+            </w:tcMar>
+          </w:tcPr>
+          <w:p>
+            <w:r>
+              <w:rPr>
+                <w:sz w:val="19"/>
+              </w:rPr>
+              <w:t>SupervisionPointcut</w:t>
+            </w:r>
+          </w:p>
+        </w:tc>
+        <w:tc>
+          <w:tcPr>
+            <w:tcW w:type="dxa" w:w="2200"/>
+            <w:tcMar>
+              <w:top w:w="80" w:type="dxa"/>
+              <w:left w:w="80" w:type="dxa"/>
+              <w:bottom w:w="80" w:type="dxa"/>
+              <w:right w:w="80" w:type="dxa"/>
+            </w:tcMar>
+          </w:tcPr>
+          <w:p>
+            <w:r>
+              <w:rPr>
+                <w:sz w:val="19"/>
+              </w:rPr>
+              <w:t>Enum</w:t>
+            </w:r>
+          </w:p>
+        </w:tc>
+        <w:tc>
+          <w:tcPr>
+            <w:tcW w:type="dxa" w:w="4360"/>
+            <w:tcMar>
+              <w:top w:w="80" w:type="dxa"/>
+              <w:left w:w="80" w:type="dxa"/>
+              <w:bottom w:w="80" w:type="dxa"/>
+              <w:right w:w="80" w:type="dxa"/>
+            </w:tcMar>
+          </w:tcPr>
+          <w:p>
+            <w:r>
+              <w:rPr>
+                <w:sz w:val="19"/>
+              </w:rPr>
+              <w:t>PRE / POST / EXCEPTION</w:t>
+            </w:r>
+          </w:p>
+        </w:tc>
+      </w:tr>
+      <w:tr>
+        <w:tc>
+          <w:tcPr>
+            <w:tcW w:type="dxa" w:w="2800"/>
+            <w:tcMar>
+              <w:top w:w="80" w:type="dxa"/>
+              <w:left w:w="80" w:type="dxa"/>
+              <w:bottom w:w="80" w:type="dxa"/>
+              <w:right w:w="80" w:type="dxa"/>
+            </w:tcMar>
+          </w:tcPr>
+          <w:p>
+            <w:r>
+              <w:rPr>
+                <w:sz w:val="19"/>
+              </w:rPr>
+              <w:t>@SyncSupervision(...)</w:t>
+            </w:r>
+          </w:p>
+        </w:tc>
+        <w:tc>
+          <w:tcPr>
+            <w:tcW w:type="dxa" w:w="2200"/>
+            <w:tcMar>
+              <w:top w:w="80" w:type="dxa"/>
+              <w:left w:w="80" w:type="dxa"/>
+              <w:bottom w:w="80" w:type="dxa"/>
+              <w:right w:w="80" w:type="dxa"/>
+            </w:tcMar>
+          </w:tcPr>
+          <w:p>
+            <w:r>
+              <w:rPr>
+                <w:sz w:val="19"/>
+              </w:rPr>
+              <w:t>Annotation, method/constructor</w:t>
+            </w:r>
+          </w:p>
+        </w:tc>
+        <w:tc>
+          <w:tcPr>
+            <w:tcW w:type="dxa" w:w="4360"/>
+            <w:tcMar>
+              <w:top w:w="80" w:type="dxa"/>
+              <w:left w:w="80" w:type="dxa"/>
+              <w:bottom w:w="80" w:type="dxa"/>
+              <w:right w:w="80" w:type="dxa"/>
+            </w:tcMar>
+          </w:tcPr>
+          <w:p>
+            <w:r>
+              <w:rPr>
+                <w:sz w:val="19"/>
+              </w:rPr>
+              <w:t>Weaves blocking, read-write dispatch at the given pointcuts</w:t>
+            </w:r>
+          </w:p>
+        </w:tc>
+      </w:tr>
+      <w:tr>
+        <w:tc>
+          <w:tcPr>
+            <w:tcW w:type="dxa" w:w="2800"/>
+            <w:tcMar>
+              <w:top w:w="80" w:type="dxa"/>
+              <w:left w:w="80" w:type="dxa"/>
+              <w:bottom w:w="80" w:type="dxa"/>
+              <w:right w:w="80" w:type="dxa"/>
+            </w:tcMar>
+          </w:tcPr>
+          <w:p>
+            <w:r>
+              <w:rPr>
+                <w:sz w:val="19"/>
+              </w:rPr>
+              <w:t>@AsyncSupervision(...)</w:t>
+            </w:r>
+          </w:p>
+        </w:tc>
+        <w:tc>
+          <w:tcPr>
+            <w:tcW w:type="dxa" w:w="2200"/>
+            <w:tcMar>
+              <w:top w:w="80" w:type="dxa"/>
+              <w:left w:w="80" w:type="dxa"/>
+              <w:bottom w:w="80" w:type="dxa"/>
+              <w:right w:w="80" w:type="dxa"/>
+            </w:tcMar>
+          </w:tcPr>
+          <w:p>
+            <w:r>
+              <w:rPr>
+                <w:sz w:val="19"/>
+              </w:rPr>
+              <w:t>Annotation, method/constructor</w:t>
+            </w:r>
+          </w:p>
+        </w:tc>
+        <w:tc>
+          <w:tcPr>
+            <w:tcW w:type="dxa" w:w="4360"/>
+            <w:tcMar>
+              <w:top w:w="80" w:type="dxa"/>
+              <w:left w:w="80" w:type="dxa"/>
+              <w:bottom w:w="80" w:type="dxa"/>
+              <w:right w:w="80" w:type="dxa"/>
+            </w:tcMar>
+          </w:tcPr>
+          <w:p>
+            <w:r>
+              <w:rPr>
+                <w:sz w:val="19"/>
+              </w:rPr>
+              <w:t>Weaves fire-and-forget, observation-only dispatch</w:t>
+            </w:r>
+          </w:p>
+        </w:tc>
+      </w:tr>
+      <w:tr>
+        <w:tc>
+          <w:tcPr>
+            <w:tcW w:type="dxa" w:w="2800"/>
+            <w:tcMar>
+              <w:top w:w="80" w:type="dxa"/>
+              <w:left w:w="80" w:type="dxa"/>
+              <w:bottom w:w="80" w:type="dxa"/>
+              <w:right w:w="80" w:type="dxa"/>
+            </w:tcMar>
+          </w:tcPr>
+          <w:p>
+            <w:r>
+              <w:rPr>
+                <w:sz w:val="19"/>
+              </w:rPr>
+              <w:t>SupervisionEvent</w:t>
+            </w:r>
+          </w:p>
+        </w:tc>
+        <w:tc>
+          <w:tcPr>
+            <w:tcW w:type="dxa" w:w="2200"/>
+            <w:tcMar>
+              <w:top w:w="80" w:type="dxa"/>
+              <w:left w:w="80" w:type="dxa"/>
+              <w:bottom w:w="80" w:type="dxa"/>
+              <w:right w:w="80" w:type="dxa"/>
+            </w:tcMar>
+          </w:tcPr>
+          <w:p>
+            <w:r>
+              <w:rPr>
+                <w:sz w:val="19"/>
+              </w:rPr>
+              <w:t>Value type</w:t>
+            </w:r>
+          </w:p>
+        </w:tc>
+        <w:tc>
+          <w:tcPr>
+            <w:tcW w:type="dxa" w:w="4360"/>
+            <w:tcMar>
+              <w:top w:w="80" w:type="dxa"/>
+              <w:left w:w="80" w:type="dxa"/>
+              <w:bottom w:w="80" w:type="dxa"/>
+              <w:right w:w="80" w:type="dxa"/>
+            </w:tcMar>
+          </w:tcPr>
+          <w:p>
+            <w:r>
+              <w:rPr>
+                <w:sz w:val="19"/>
+              </w:rPr>
+              <w:t>Pointcut, instance, Executable, mutable arguments/returnValue/thrown</w:t>
+            </w:r>
+          </w:p>
+        </w:tc>
+      </w:tr>
+      <w:tr>
+        <w:tc>
+          <w:tcPr>
+            <w:tcW w:type="dxa" w:w="2800"/>
+            <w:tcMar>
+              <w:top w:w="80" w:type="dxa"/>
+              <w:left w:w="80" w:type="dxa"/>
+              <w:bottom w:w="80" w:type="dxa"/>
+              <w:right w:w="80" w:type="dxa"/>
+            </w:tcMar>
+          </w:tcPr>
+          <w:p>
+            <w:r>
+              <w:rPr>
+                <w:sz w:val="19"/>
+              </w:rPr>
+              <w:t>SyncSupervisionListener</w:t>
+            </w:r>
+          </w:p>
+        </w:tc>
+        <w:tc>
+          <w:tcPr>
+            <w:tcW w:type="dxa" w:w="2200"/>
+            <w:tcMar>
+              <w:top w:w="80" w:type="dxa"/>
+              <w:left w:w="80" w:type="dxa"/>
+              <w:bottom w:w="80" w:type="dxa"/>
+              <w:right w:w="80" w:type="dxa"/>
+            </w:tcMar>
+          </w:tcPr>
+          <w:p>
+            <w:r>
+              <w:rPr>
+                <w:sz w:val="19"/>
+              </w:rPr>
+              <w:t>Interface</w:t>
+            </w:r>
+          </w:p>
+        </w:tc>
+        <w:tc>
+          <w:tcPr>
+            <w:tcW w:type="dxa" w:w="4360"/>
+            <w:tcMar>
+              <w:top w:w="80" w:type="dxa"/>
+              <w:left w:w="80" w:type="dxa"/>
+              <w:bottom w:w="80" w:type="dxa"/>
+              <w:right w:w="80" w:type="dxa"/>
+            </w:tcMar>
+          </w:tcPr>
+          <w:p>
+            <w:r>
+              <w:rPr>
+                <w:sz w:val="19"/>
+              </w:rPr>
+              <w:t>onPre/onPost/onException, real mutation rights, default no-ops</w:t>
+            </w:r>
+          </w:p>
+        </w:tc>
+      </w:tr>
+      <w:tr>
+        <w:tc>
+          <w:tcPr>
+            <w:tcW w:type="dxa" w:w="2800"/>
+            <w:tcMar>
+              <w:top w:w="80" w:type="dxa"/>
+              <w:left w:w="80" w:type="dxa"/>
+              <w:bottom w:w="80" w:type="dxa"/>
+              <w:right w:w="80" w:type="dxa"/>
+            </w:tcMar>
+          </w:tcPr>
+          <w:p>
+            <w:r>
+              <w:rPr>
+                <w:sz w:val="19"/>
+              </w:rPr>
+              <w:t>AsyncSupervisionListener</w:t>
+            </w:r>
+          </w:p>
+        </w:tc>
+        <w:tc>
+          <w:tcPr>
+            <w:tcW w:type="dxa" w:w="2200"/>
+            <w:tcMar>
+              <w:top w:w="80" w:type="dxa"/>
+              <w:left w:w="80" w:type="dxa"/>
+              <w:bottom w:w="80" w:type="dxa"/>
+              <w:right w:w="80" w:type="dxa"/>
+            </w:tcMar>
+          </w:tcPr>
+          <w:p>
+            <w:r>
+              <w:rPr>
+                <w:sz w:val="19"/>
+              </w:rPr>
+              <w:t>Interface</w:t>
+            </w:r>
+          </w:p>
+        </w:tc>
+        <w:tc>
+          <w:tcPr>
+            <w:tcW w:type="dxa" w:w="4360"/>
+            <w:tcMar>
+              <w:top w:w="80" w:type="dxa"/>
+              <w:left w:w="80" w:type="dxa"/>
+              <w:bottom w:w="80" w:type="dxa"/>
+              <w:right w:w="80" w:type="dxa"/>
+            </w:tcMar>
+          </w:tcPr>
+          <w:p>
+            <w:r>
+              <w:rPr>
+                <w:sz w:val="19"/>
+              </w:rPr>
+              <w:t>Same three methods, observation-only, mutations discarded</w:t>
+            </w:r>
+          </w:p>
+        </w:tc>
+      </w:tr>
+      <w:tr>
+        <w:tc>
+          <w:tcPr>
+            <w:tcW w:type="dxa" w:w="2800"/>
+            <w:tcMar>
+              <w:top w:w="80" w:type="dxa"/>
+              <w:left w:w="80" w:type="dxa"/>
+              <w:bottom w:w="80" w:type="dxa"/>
+              <w:right w:w="80" w:type="dxa"/>
+            </w:tcMar>
+          </w:tcPr>
+          <w:p>
+            <w:r>
+              <w:rPr>
+                <w:sz w:val="19"/>
+              </w:rPr>
+              <w:t>JavAISupervisionRuntime</w:t>
+            </w:r>
+          </w:p>
+        </w:tc>
+        <w:tc>
+          <w:tcPr>
+            <w:tcW w:type="dxa" w:w="2200"/>
+            <w:tcMar>
+              <w:top w:w="80" w:type="dxa"/>
+              <w:left w:w="80" w:type="dxa"/>
+              <w:bottom w:w="80" w:type="dxa"/>
+              <w:right w:w="80" w:type="dxa"/>
+            </w:tcMar>
+          </w:tcPr>
+          <w:p>
+            <w:r>
+              <w:rPr>
+                <w:sz w:val="19"/>
+              </w:rPr>
+              <w:t>Static facade</w:t>
+            </w:r>
+          </w:p>
+        </w:tc>
+        <w:tc>
+          <w:tcPr>
+            <w:tcW w:type="dxa" w:w="4360"/>
+            <w:tcMar>
+              <w:top w:w="80" w:type="dxa"/>
+              <w:left w:w="80" w:type="dxa"/>
+              <w:bottom w:w="80" w:type="dxa"/>
+              <w:right w:w="80" w:type="dxa"/>
+            </w:tcMar>
+          </w:tcPr>
+          <w:p>
+            <w:r>
+              <w:rPr>
+                <w:sz w:val="19"/>
+              </w:rPr>
+              <w:t>Listener registration + the dispatch logic Advice calls into</w:t>
+            </w:r>
+          </w:p>
+        </w:tc>
+      </w:tr>
+    </w:tbl>
+    <w:p>
+      <w:pPr>
+        <w:spacing w:after="160"/>
+      </w:pPr>
+      <w:r>
+        <w:rPr>
+          <w:b w:val="0"/>
+          <w:i w:val="0"/>
+        </w:rPr>
+        <w:t>Opt-in and sparse by design, deliberately unlike Vector Core's blanket, class-level weaving: an LLM round trip is, at minimum, on the order of 100ms (§5.3); a method call can happen millions of times a second. Every @SyncSupervision/@AsyncSupervision is a specific annotation on a specific method or constructor, chosen because that particular join point is worth the cost of being observable or interruptible — there is no class-level form, and weaving a call site doesn't guarantee a listener actually responds to it. Weaving and listener registration are independent, the same separation the AoP lineage above already had between a class opting in and an Advisor actually being registered.</w:t>
+      </w:r>
+    </w:p>
+    <w:p>
+      <w:pPr>
+        <w:spacing w:after="160"/>
+      </w:pPr>
+      <w:r>
+        <w:rPr>
+          <w:b w:val="0"/>
+          <w:i w:val="0"/>
+        </w:rPr>
+        <w:t>At a given pointcut on a given call, every registered SyncSupervisionListener scoped to the call runs first, on the calling thread, in registration order, each free to further mutate whatever the previous one left behind. Once that tier resolves, the event — now reflecting whatever it committed to — is handed to every registered AsyncSupervisionListener scoped to the call, dispatched onto a virtual-thread-per-task executor, fire-and-forget; the calling thread never waits on it, no matter how long a listener takes. This directly answers the risk this design surfaces on its own: an AoP join point can trigger arbitrarily long-running work — an LLM agent loop, potentially with its own tool calls, could genuinely take a long time. Blocking unconditionally on that would make the mechanism unusable for anything but the rarest, most deliberate interception point; splitting delivery into a blocking tier with real control and a non-blocking tier with none means a method can demand a synchronous veto or rewrite exactly where that's load-bearing, and fan out slower, more open-ended reactions everywhere else, on the same mechanism. “Trigger other work in response to this call” belongs to the async tier: it can never reach back and change the call that triggered it, but nothing stops it from having arbitrary side effects elsewhere.</w:t>
+      </w:r>
+    </w:p>
+    <w:tbl>
+      <w:tblPr>
+        <w:tblW w:type="auto" w:w="0"/>
+        <w:jc w:val="center"/>
+        <w:tblBorders>
+          <w:top w:val="none" w:sz="0" w:space="0" w:color="auto"/>
+          <w:left w:val="none" w:sz="0" w:space="0" w:color="auto"/>
+          <w:bottom w:val="none" w:sz="0" w:space="0" w:color="auto"/>
+          <w:right w:val="none" w:sz="0" w:space="0" w:color="auto"/>
+          <w:insideH w:val="none" w:sz="0" w:space="0" w:color="auto"/>
+          <w:insideV w:val="none" w:sz="0" w:space="0" w:color="auto"/>
+        </w:tblBorders>
+        <w:tblLayout w:type="fixed"/>
+        <w:tblLook w:firstColumn="1" w:firstRow="1" w:lastColumn="0" w:lastRow="0" w:noHBand="0" w:noVBand="1" w:val="04A0"/>
+      </w:tblPr>
+      <w:tblGrid>
+        <w:gridCol w:w="9360"/>
+      </w:tblGrid>
+      <w:tr>
+        <w:tc>
+          <w:tcPr>
+            <w:tcW w:type="dxa" w:w="8928"/>
+            <w:shd w:val="clear" w:color="auto" w:fill="1E1E1E"/>
+            <w:tcMar>
+              <w:top w:w="120" w:type="dxa"/>
+              <w:left w:w="160" w:type="dxa"/>
+              <w:bottom w:w="120" w:type="dxa"/>
+              <w:right w:w="160" w:type="dxa"/>
+            </w:tcMar>
+          </w:tcPr>
+          <w:p>
+            <w:pPr>
+              <w:spacing w:before="0" w:after="0" w:line="240" w:lineRule="auto"/>
+            </w:pPr>
+            <w:r>
+              <w:rPr>
+                <w:rFonts w:ascii="Consolas" w:hAnsi="Consolas"/>
+                <w:color w:val="D4D4D4"/>
+                <w:sz w:val="19"/>
+              </w:rPr>
+              <w:t>class Article {</w:t>
+            </w:r>
+          </w:p>
+          <w:p>
+            <w:pPr>
+              <w:spacing w:before="0" w:after="0" w:line="240" w:lineRule="auto"/>
+            </w:pPr>
+          </w:p>
+          <w:p>
+            <w:pPr>
+              <w:spacing w:before="0" w:after="0" w:line="240" w:lineRule="auto"/>
+            </w:pPr>
+            <w:r>
+              <w:rPr>
+                <w:rFonts w:ascii="Consolas" w:hAnsi="Consolas"/>
+                <w:color w:val="D4D4D4"/>
+                <w:sz w:val="19"/>
+              </w:rPr>
+              <w:t xml:space="preserve">    @SyncSupervision(SupervisionPointcut.PRE)</w:t>
+            </w:r>
+          </w:p>
+          <w:p>
+            <w:pPr>
+              <w:spacing w:before="0" w:after="0" w:line="240" w:lineRule="auto"/>
+            </w:pPr>
+            <w:r>
+              <w:rPr>
+                <w:rFonts w:ascii="Consolas" w:hAnsi="Consolas"/>
+                <w:color w:val="D4D4D4"/>
+                <w:sz w:val="19"/>
+              </w:rPr>
+              <w:t xml:space="preserve">    @AsyncSupervision(SupervisionPointcut.POST)</w:t>
+            </w:r>
+          </w:p>
+          <w:p>
+            <w:pPr>
+              <w:spacing w:before="0" w:after="0" w:line="240" w:lineRule="auto"/>
+            </w:pPr>
+            <w:r>
+              <w:rPr>
+                <w:rFonts w:ascii="Consolas" w:hAnsi="Consolas"/>
+                <w:color w:val="569CD6"/>
+                <w:sz w:val="19"/>
+              </w:rPr>
+              <w:t xml:space="preserve">    public</w:t>
+            </w:r>
+            <w:r>
+              <w:rPr>
+                <w:rFonts w:ascii="Consolas" w:hAnsi="Consolas"/>
+                <w:color w:val="D4D4D4"/>
+                <w:sz w:val="19"/>
+              </w:rPr>
+              <w:t xml:space="preserve"> void publish() {</w:t>
+            </w:r>
+          </w:p>
+          <w:p>
+            <w:pPr>
+              <w:spacing w:before="0" w:after="0" w:line="240" w:lineRule="auto"/>
+            </w:pPr>
+            <w:r>
+              <w:rPr>
+                <w:rFonts w:ascii="Consolas" w:hAnsi="Consolas"/>
+                <w:color w:val="6A9955"/>
+                <w:sz w:val="19"/>
+              </w:rPr>
+              <w:t xml:space="preserve">        // ...</w:t>
+            </w:r>
+          </w:p>
+          <w:p>
+            <w:pPr>
+              <w:spacing w:before="0" w:after="0" w:line="240" w:lineRule="auto"/>
+            </w:pPr>
+            <w:r>
+              <w:rPr>
+                <w:rFonts w:ascii="Consolas" w:hAnsi="Consolas"/>
+                <w:color w:val="D4D4D4"/>
+                <w:sz w:val="19"/>
+              </w:rPr>
+              <w:t xml:space="preserve">    }</w:t>
+            </w:r>
+          </w:p>
+          <w:p>
+            <w:pPr>
+              <w:spacing w:before="0" w:after="0" w:line="240" w:lineRule="auto"/>
+            </w:pPr>
+            <w:r>
+              <w:rPr>
+                <w:rFonts w:ascii="Consolas" w:hAnsi="Consolas"/>
+                <w:color w:val="D4D4D4"/>
+                <w:sz w:val="19"/>
+              </w:rPr>
+              <w:t>}</w:t>
+            </w:r>
+          </w:p>
+          <w:p>
+            <w:pPr>
+              <w:spacing w:before="0" w:after="0" w:line="240" w:lineRule="auto"/>
+            </w:pPr>
+          </w:p>
+          <w:p>
+            <w:pPr>
+              <w:spacing w:before="0" w:after="0" w:line="240" w:lineRule="auto"/>
+            </w:pPr>
+            <w:r>
+              <w:rPr>
+                <w:rFonts w:ascii="Consolas" w:hAnsi="Consolas"/>
+                <w:color w:val="6A9955"/>
+                <w:sz w:val="19"/>
+              </w:rPr>
+              <w:t>// Blocking veto power, exercised at PRE:</w:t>
+            </w:r>
+          </w:p>
+          <w:p>
+            <w:pPr>
+              <w:spacing w:before="0" w:after="0" w:line="240" w:lineRule="auto"/>
+            </w:pPr>
+            <w:r>
+              <w:rPr>
+                <w:rFonts w:ascii="Consolas" w:hAnsi="Consolas"/>
+                <w:color w:val="4EC9C0"/>
+                <w:sz w:val="19"/>
+              </w:rPr>
+              <w:t>JavAISupervisionRuntime</w:t>
+            </w:r>
+            <w:r>
+              <w:rPr>
+                <w:rFonts w:ascii="Consolas" w:hAnsi="Consolas"/>
+                <w:color w:val="D4D4D4"/>
+                <w:sz w:val="19"/>
+              </w:rPr>
+              <w:t>.registerSyncListener(</w:t>
+            </w:r>
+            <w:r>
+              <w:rPr>
+                <w:rFonts w:ascii="Consolas" w:hAnsi="Consolas"/>
+                <w:color w:val="569CD6"/>
+                <w:sz w:val="19"/>
+              </w:rPr>
+              <w:t>new</w:t>
+            </w:r>
+            <w:r>
+              <w:rPr>
+                <w:rFonts w:ascii="Consolas" w:hAnsi="Consolas"/>
+                <w:color w:val="D4D4D4"/>
+                <w:sz w:val="19"/>
+              </w:rPr>
+              <w:t xml:space="preserve"> SyncSupervisionListener() {</w:t>
+            </w:r>
+          </w:p>
+          <w:p>
+            <w:pPr>
+              <w:spacing w:before="0" w:after="0" w:line="240" w:lineRule="auto"/>
+            </w:pPr>
+            <w:r>
+              <w:rPr>
+                <w:rFonts w:ascii="Consolas" w:hAnsi="Consolas"/>
+                <w:color w:val="D4D4D4"/>
+                <w:sz w:val="19"/>
+              </w:rPr>
+              <w:t xml:space="preserve">    </w:t>
+            </w:r>
+            <w:r>
+              <w:rPr>
+                <w:rFonts w:ascii="Consolas" w:hAnsi="Consolas"/>
+                <w:color w:val="4EC9C0"/>
+                <w:sz w:val="19"/>
+              </w:rPr>
+              <w:t>@Override</w:t>
+            </w:r>
+          </w:p>
+          <w:p>
+            <w:pPr>
+              <w:spacing w:before="0" w:after="0" w:line="240" w:lineRule="auto"/>
+            </w:pPr>
+            <w:r>
+              <w:rPr>
+                <w:rFonts w:ascii="Consolas" w:hAnsi="Consolas"/>
+                <w:color w:val="569CD6"/>
+                <w:sz w:val="19"/>
+              </w:rPr>
+              <w:t xml:space="preserve">    public</w:t>
+            </w:r>
+            <w:r>
+              <w:rPr>
+                <w:rFonts w:ascii="Consolas" w:hAnsi="Consolas"/>
+                <w:color w:val="D4D4D4"/>
+                <w:sz w:val="19"/>
+              </w:rPr>
+              <w:t xml:space="preserve"> void onPre(SupervisionEvent event) {</w:t>
+            </w:r>
+          </w:p>
+          <w:p>
+            <w:pPr>
+              <w:spacing w:before="0" w:after="0" w:line="240" w:lineRule="auto"/>
+            </w:pPr>
+            <w:r>
+              <w:rPr>
+                <w:rFonts w:ascii="Consolas" w:hAnsi="Consolas"/>
+                <w:color w:val="569CD6"/>
+                <w:sz w:val="19"/>
+              </w:rPr>
+              <w:t xml:space="preserve">        if</w:t>
+            </w:r>
+            <w:r>
+              <w:rPr>
+                <w:rFonts w:ascii="Consolas" w:hAnsi="Consolas"/>
+                <w:color w:val="D4D4D4"/>
+                <w:sz w:val="19"/>
+              </w:rPr>
+              <w:t xml:space="preserve"> (!moderationPolicy.allows(event.instance())) {</w:t>
+            </w:r>
+          </w:p>
+          <w:p>
+            <w:pPr>
+              <w:spacing w:before="0" w:after="0" w:line="240" w:lineRule="auto"/>
+            </w:pPr>
+            <w:r>
+              <w:rPr>
+                <w:rFonts w:ascii="Consolas" w:hAnsi="Consolas"/>
+                <w:color w:val="569CD6"/>
+                <w:sz w:val="19"/>
+              </w:rPr>
+              <w:t xml:space="preserve">            throw</w:t>
+            </w:r>
+            <w:r>
+              <w:rPr>
+                <w:rFonts w:ascii="Consolas" w:hAnsi="Consolas"/>
+                <w:color w:val="569CD6"/>
+                <w:sz w:val="19"/>
+              </w:rPr>
+              <w:t xml:space="preserve"> new</w:t>
+            </w:r>
+            <w:r>
+              <w:rPr>
+                <w:rFonts w:ascii="Consolas" w:hAnsi="Consolas"/>
+                <w:color w:val="D4D4D4"/>
+                <w:sz w:val="19"/>
+              </w:rPr>
+              <w:t xml:space="preserve"> IllegalStateException(</w:t>
+            </w:r>
+            <w:r>
+              <w:rPr>
+                <w:rFonts w:ascii="Consolas" w:hAnsi="Consolas"/>
+                <w:color w:val="CE9178"/>
+                <w:sz w:val="19"/>
+              </w:rPr>
+              <w:t>"blocked by moderation policy"</w:t>
+            </w:r>
+            <w:r>
+              <w:rPr>
+                <w:rFonts w:ascii="Consolas" w:hAnsi="Consolas"/>
+                <w:color w:val="D4D4D4"/>
+                <w:sz w:val="19"/>
+              </w:rPr>
+              <w:t>);</w:t>
+            </w:r>
+          </w:p>
+          <w:p>
+            <w:pPr>
+              <w:spacing w:before="0" w:after="0" w:line="240" w:lineRule="auto"/>
+            </w:pPr>
+            <w:r>
+              <w:rPr>
+                <w:rFonts w:ascii="Consolas" w:hAnsi="Consolas"/>
+                <w:color w:val="D4D4D4"/>
+                <w:sz w:val="19"/>
+              </w:rPr>
+              <w:t xml:space="preserve">        }</w:t>
+            </w:r>
+          </w:p>
+          <w:p>
+            <w:pPr>
+              <w:spacing w:before="0" w:after="0" w:line="240" w:lineRule="auto"/>
+            </w:pPr>
+            <w:r>
+              <w:rPr>
+                <w:rFonts w:ascii="Consolas" w:hAnsi="Consolas"/>
+                <w:color w:val="D4D4D4"/>
+                <w:sz w:val="19"/>
+              </w:rPr>
+              <w:t xml:space="preserve">    }</w:t>
+            </w:r>
+          </w:p>
+          <w:p>
+            <w:pPr>
+              <w:spacing w:before="0" w:after="0" w:line="240" w:lineRule="auto"/>
+            </w:pPr>
+            <w:r>
+              <w:rPr>
+                <w:rFonts w:ascii="Consolas" w:hAnsi="Consolas"/>
+                <w:color w:val="D4D4D4"/>
+                <w:sz w:val="19"/>
+              </w:rPr>
+              <w:t>});</w:t>
+            </w:r>
+          </w:p>
+          <w:p>
+            <w:pPr>
+              <w:spacing w:before="0" w:after="0" w:line="240" w:lineRule="auto"/>
+            </w:pPr>
+          </w:p>
+          <w:p>
+            <w:pPr>
+              <w:spacing w:before="0" w:after="0" w:line="240" w:lineRule="auto"/>
+            </w:pPr>
+            <w:r>
+              <w:rPr>
+                <w:rFonts w:ascii="Consolas" w:hAnsi="Consolas"/>
+                <w:color w:val="6A9955"/>
+                <w:sz w:val="19"/>
+              </w:rPr>
+              <w:t>// Fire-and-forget reaction, exercised at POST, doesn't hold up publish():</w:t>
+            </w:r>
+          </w:p>
+          <w:p>
+            <w:pPr>
+              <w:spacing w:before="0" w:after="0" w:line="240" w:lineRule="auto"/>
+            </w:pPr>
+            <w:r>
+              <w:rPr>
+                <w:rFonts w:ascii="Consolas" w:hAnsi="Consolas"/>
+                <w:color w:val="4EC9C0"/>
+                <w:sz w:val="19"/>
+              </w:rPr>
+              <w:t>JavAISupervisionRuntime</w:t>
+            </w:r>
+            <w:r>
+              <w:rPr>
+                <w:rFonts w:ascii="Consolas" w:hAnsi="Consolas"/>
+                <w:color w:val="D4D4D4"/>
+                <w:sz w:val="19"/>
+              </w:rPr>
+              <w:t>.registerAsyncListener(</w:t>
+            </w:r>
+            <w:r>
+              <w:rPr>
+                <w:rFonts w:ascii="Consolas" w:hAnsi="Consolas"/>
+                <w:color w:val="569CD6"/>
+                <w:sz w:val="19"/>
+              </w:rPr>
+              <w:t>new</w:t>
+            </w:r>
+            <w:r>
+              <w:rPr>
+                <w:rFonts w:ascii="Consolas" w:hAnsi="Consolas"/>
+                <w:color w:val="D4D4D4"/>
+                <w:sz w:val="19"/>
+              </w:rPr>
+              <w:t xml:space="preserve"> AsyncSupervisionListener() {</w:t>
+            </w:r>
+          </w:p>
+          <w:p>
+            <w:pPr>
+              <w:spacing w:before="0" w:after="0" w:line="240" w:lineRule="auto"/>
+            </w:pPr>
+            <w:r>
+              <w:rPr>
+                <w:rFonts w:ascii="Consolas" w:hAnsi="Consolas"/>
+                <w:color w:val="D4D4D4"/>
+                <w:sz w:val="19"/>
+              </w:rPr>
+              <w:t xml:space="preserve">    </w:t>
+            </w:r>
+            <w:r>
+              <w:rPr>
+                <w:rFonts w:ascii="Consolas" w:hAnsi="Consolas"/>
+                <w:color w:val="4EC9C0"/>
+                <w:sz w:val="19"/>
+              </w:rPr>
+              <w:t>@Override</w:t>
+            </w:r>
+          </w:p>
+          <w:p>
+            <w:pPr>
+              <w:spacing w:before="0" w:after="0" w:line="240" w:lineRule="auto"/>
+            </w:pPr>
+            <w:r>
+              <w:rPr>
+                <w:rFonts w:ascii="Consolas" w:hAnsi="Consolas"/>
+                <w:color w:val="569CD6"/>
+                <w:sz w:val="19"/>
+              </w:rPr>
+              <w:t xml:space="preserve">    public</w:t>
+            </w:r>
+            <w:r>
+              <w:rPr>
+                <w:rFonts w:ascii="Consolas" w:hAnsi="Consolas"/>
+                <w:color w:val="D4D4D4"/>
+                <w:sz w:val="19"/>
+              </w:rPr>
+              <w:t xml:space="preserve"> void onPost(SupervisionEvent event) {</w:t>
+            </w:r>
+          </w:p>
+          <w:p>
+            <w:pPr>
+              <w:spacing w:before="0" w:after="0" w:line="240" w:lineRule="auto"/>
+            </w:pPr>
+            <w:r>
+              <w:rPr>
+                <w:rFonts w:ascii="Consolas" w:hAnsi="Consolas"/>
+                <w:color w:val="D4D4D4"/>
+                <w:sz w:val="19"/>
+              </w:rPr>
+              <w:t xml:space="preserve">        agenticListener.reviewAndMaybeFlag(event.instance());</w:t>
+            </w:r>
+          </w:p>
+          <w:p>
+            <w:pPr>
+              <w:spacing w:before="0" w:after="0" w:line="240" w:lineRule="auto"/>
+            </w:pPr>
+            <w:r>
+              <w:rPr>
+                <w:rFonts w:ascii="Consolas" w:hAnsi="Consolas"/>
+                <w:color w:val="D4D4D4"/>
+                <w:sz w:val="19"/>
+              </w:rPr>
+              <w:t xml:space="preserve">    }</w:t>
+            </w:r>
+          </w:p>
+          <w:p>
+            <w:pPr>
+              <w:spacing w:before="0" w:after="0" w:line="240" w:lineRule="auto"/>
+            </w:pPr>
+            <w:r>
+              <w:rPr>
+                <w:rFonts w:ascii="Consolas" w:hAnsi="Consolas"/>
+                <w:color w:val="D4D4D4"/>
+                <w:sz w:val="19"/>
+              </w:rPr>
+              <w:t>});</w:t>
+            </w:r>
+          </w:p>
+        </w:tc>
+      </w:tr>
+    </w:tbl>
+    <w:p>
+      <w:pPr>
+        <w:spacing w:before="80"/>
+        <w:jc w:val="center"/>
+      </w:pPr>
+      <w:r>
+        <w:rPr>
+          <w:i/>
+          <w:color w:val="555555"/>
+          <w:sz w:val="19"/>
+        </w:rPr>
+        <w:t>Example 31. Sync and async Agentic Supervision on the same method — one blocking with real veto power, one fire-and-forget.</w:t>
+      </w:r>
+    </w:p>
+    <w:p>
+      <w:pPr>
+        <w:spacing w:after="160"/>
+      </w:pPr>
+      <w:r>
+        <w:rPr>
+          <w:b w:val="0"/>
+          <w:i w:val="0"/>
+        </w:rPr>
+        <w:t>Hard rule: this area's own supervision-runtime classes must never carry @SyncSupervision/@AsyncSupervision. Weaving selection is opt-in and method-scoped, so this can only happen if someone explicitly annotates the runtime's own code — the AoP lineage above had to solve the analogous problem with a classloader-level package denylist, because its weaving was blanket rather than opt-in; that denylist has no equivalent here, because opt-in selection means there's nothing to forget to exclude. Advice on advice is an infinite loop, not a subtle bug.</w:t>
+      </w:r>
+    </w:p>
+    <w:p>
+      <w:pPr>
+        <w:spacing w:after="160"/>
+      </w:pPr>
+      <w:r>
+        <w:rPr>
+          <w:b w:val="0"/>
+          <w:i w:val="0"/>
+        </w:rPr>
+        <w:t>Relationship to the rest of this document: Agentic Supervision is not implemented via Acceleration Substrate (§5.6). That module is deliberately the first thing Phase 0 proves, and if this area's weaving lived there instead of in its own component, an Agentic Listener implementation eventually wanting Completion Fabric (to call an LLM) or Vector Collections/Vector Core (to ground its decision) would drag Acceleration Substrate downstream of the entire rest of the reactor. It is instead a second, independent, equally early risk spike — its own weaver, no dependency on Acceleration Substrate and none the other direction either. It is also a different axis from Codegen Guidance (§5.5), despite surface similarity: @AgentWritable/@Frozen/@HumanOnly govern what an agent may edit, at design time; @SyncSupervision/@AsyncSupervision govern what an agent may observe or intervene on, at run time. A supervised method's behavior is not fully determined by its own body — a registered listener can change control flow, arguments, or results — which is precisely what @Nondeterministic and @Costly already exist to flag, so a supervised method should carry those too, as an explicit, visible statement in source rather than something the weaver silently implies.</w:t>
+      </w:r>
+    </w:p>
+    <w:p>
+      <w:pPr>
+        <w:pStyle w:val="Heading2"/>
+      </w:pPr>
+      <w:r>
+        <w:t>5.8 Existing Projects: Depend On, Don't Fork</w:t>
+      </w:r>
+    </w:p>
+    <w:p>
+      <w:pPr>
+        <w:spacing w:after="160"/>
+      </w:pPr>
+      <w:r>
+        <w:rPr>
+          <w:b w:val="0"/>
+          <w:i w:val="0"/>
+        </w:rPr>
+        <w:t>A posture that cuts across all seven areas above, not one of them individually — Agentic Supervision (§5.7) follows it too, via ByteBuddy as an ordinary library dependency, its own independent installer rather than a fork of anything: consistent with the preference to avoid forking, none of the following are proposed for forking. Each is an ordinary library/build dependency:</w:t>
       </w:r>
     </w:p>
     <w:tbl>
@@ -15239,7 +16305,7 @@
         <w:pStyle w:val="Heading2"/>
       </w:pPr>
       <w:r>
-        <w:t>5.8 Cross-Dependencies Between Extension Areas</w:t>
+        <w:t>5.9 Cross-Dependencies Between Extension Areas</w:t>
       </w:r>
     </w:p>
     <w:p>
@@ -15251,7 +16317,7 @@
           <w:b w:val="0"/>
           <w:i w:val="0"/>
         </w:rPr>
-        <w:t>The six areas above are not six independent bets — most of them only make sense because another area exists underneath them. Acceleration Substrate (§5.6) is the foundation: it's the compiler/weaver that actually implements Vector Core's interface and Vector Collections' graph types, and the mechanism that turns Codegen Guidance's annotations into enforced behavior rather than inert metadata. Vector Core (§5.1) is the next layer up: Vector Collections (§5.4) calls straight into its EmbeddingVector and similarityTo() primitives to implement cosine-distance sorting and graph-node similarity, and Persistence Bridge (§5.2) has nothing to persist without it. Vector Collections, in turn, is what Persistence Bridge actually maps onto a store (a KnowledgeGraph or JavAIList is the thing a repository query returns) and what Completion Fabric (§5.3) consumes directly through toContext() — which is why Completion Fabric depends on Vector Collections one hop before it depends on Vector Core at all. Codegen Guidance (§5.5) is the one area that mostly doesn't feed forward into the others: it's consumed by Acceleration Substrate's compiler/weaver, and — per §5.9 — is the most likely foundation for a future agent-orchestration extension, but nothing in §5.1–§5.4 depends on it.</w:t>
+        <w:t>The first six areas above are not six independent bets — most of them only make sense because another area exists underneath them. Acceleration Substrate (§5.6) is the foundation: it's the compiler/weaver that actually implements Vector Core's interface and Vector Collections' graph types, and the mechanism that turns Codegen Guidance's annotations into enforced behavior rather than inert metadata. Vector Core (§5.1) is the next layer up: Vector Collections (§5.4) calls straight into its EmbeddingVector and similarityTo() primitives to implement cosine-distance sorting and graph-node similarity, and Persistence Bridge (§5.2) has nothing to persist without it. Vector Collections, in turn, is what Persistence Bridge actually maps onto a store (a KnowledgeGraph or JavAIList is the thing a repository query returns) and what Completion Fabric (§5.3) consumes directly through toContext() — which is why Completion Fabric depends on Vector Collections one hop before it depends on Vector Core at all. Codegen Guidance (§5.5) is the one area that mostly doesn't feed forward into the others: it's consumed by Acceleration Substrate's compiler/weaver, and — per §5.10 — is the most likely foundation for a future agent-orchestration extension distinct from §5.7 Agentic Supervision (that candidate is about exposing methods AS callable tools; §5.7 is about intercepting calls that already happen) — but nothing in §5.1–§5.4 depends on it.</w:t>
       </w:r>
     </w:p>
     <w:p>
@@ -15303,7 +16369,7 @@
           <w:color w:val="555555"/>
           <w:sz w:val="19"/>
         </w:rPr>
-        <w:t>Figure 5. Layered dependency structure across the six extension areas — arrows read as “required by.”</w:t>
+        <w:t>Figure 5. Layered dependency structure across the first six extension areas — arrows read as “required by.” Agentic Supervision (§5.7, added after this figure was drawn) is deliberately not pictured here: it depends only on §5.5's annotation vocabulary via javai-annotations, not on Acceleration Substrate's weaver, and nothing above depends on it. See SPEC.md's text-form dependency diagram for the current, seven-area picture.</w:t>
       </w:r>
     </w:p>
     <w:p>
@@ -15323,7 +16389,7 @@
         <w:pStyle w:val="Heading2"/>
       </w:pPr>
       <w:r>
-        <w:t>5.9 Additional Possible Future Extension Areas</w:t>
+        <w:t>5.10 Additional Possible Future Extension Areas</w:t>
       </w:r>
     </w:p>
     <w:p>
@@ -15335,7 +16401,7 @@
           <w:b w:val="0"/>
           <w:i w:val="0"/>
         </w:rPr>
-        <w:t>Speculative — not scoped into the Phase 0–3 roadmap in §9, and not costed in the Go/No-Go analysis in §10. Included because each follows naturally from the six areas above, and a future pass through this whitepaper may want to promote one to a scoped area of its own.</w:t>
+        <w:t>Speculative — not scoped into the Phase 0–3 roadmap in §9, and not costed in the Go/No-Go analysis in §10. Included because each follows naturally from the areas above, and a future pass through this whitepaper may want to promote one to a scoped area of its own — as §5.7 Agentic Supervision itself was, promoted from a one-line pitch in this table to a full area.</w:t>
       </w:r>
     </w:p>
     <w:tbl>
@@ -21738,7 +22804,7 @@
           <w:b w:val="0"/>
           <w:i w:val="0"/>
         </w:rPr>
-        <w:t>The mechanism that makes this possible without a compiler is the same one Hibernate already uses for dirty-checking (§4.3): ByteBuddy-based class weaving, applied either at class-load time via a -javaagent or at build time via a Maven/Gradle plugin for teams that prefer ahead-of-time weaving. Six components, each independently a plain library:</w:t>
+        <w:t>The mechanism that makes this possible without a compiler is the same one Hibernate already uses for dirty-checking (§4.3): ByteBuddy-based class weaving, applied either at class-load time via a -javaagent or at build time via a Maven/Gradle plugin for teams that prefer ahead-of-time weaving. Seven components, each independently a plain library:</w:t>
       </w:r>
     </w:p>
     <w:tbl>
@@ -21938,6 +23004,65 @@
                 <w:sz w:val="19"/>
               </w:rPr>
               <w:t>Implements JavAIVectorizable/JavAIGraphNode on any annotated class: interface implementation, synthetic dirty-flag/back-edge fields, per-field vector-accessor generation (bodyVector(), etc.), setter rewriting for the §4.3 mutation hook — the stand-in for javaic until Phase 1</w:t>
+            </w:r>
+          </w:p>
+        </w:tc>
+      </w:tr>
+      <w:tr>
+        <w:tc>
+          <w:tcPr>
+            <w:tcW w:type="dxa" w:w="2736"/>
+            <w:tcMar>
+              <w:top w:w="80" w:type="dxa"/>
+              <w:left w:w="80" w:type="dxa"/>
+              <w:bottom w:w="80" w:type="dxa"/>
+              <w:right w:w="80" w:type="dxa"/>
+            </w:tcMar>
+          </w:tcPr>
+          <w:p>
+            <w:r>
+              <w:rPr>
+                <w:sz w:val="19"/>
+              </w:rPr>
+              <w:t>javai-supervision</w:t>
+            </w:r>
+          </w:p>
+        </w:tc>
+        <w:tc>
+          <w:tcPr>
+            <w:tcW w:type="dxa" w:w="4320"/>
+            <w:tcMar>
+              <w:top w:w="80" w:type="dxa"/>
+              <w:left w:w="80" w:type="dxa"/>
+              <w:bottom w:w="80" w:type="dxa"/>
+              <w:right w:w="80" w:type="dxa"/>
+            </w:tcMar>
+          </w:tcPr>
+          <w:p>
+            <w:r>
+              <w:rPr>
+                <w:sz w:val="19"/>
+              </w:rPr>
+              <w:t>ByteBuddy weaving, its own independent installer (not the §9.1 agent/enhancer above)</w:t>
+            </w:r>
+          </w:p>
+        </w:tc>
+        <w:tc>
+          <w:tcPr>
+            <w:tcW w:type="dxa" w:w="4752"/>
+            <w:tcMar>
+              <w:top w:w="80" w:type="dxa"/>
+              <w:left w:w="80" w:type="dxa"/>
+              <w:bottom w:w="80" w:type="dxa"/>
+              <w:right w:w="80" w:type="dxa"/>
+            </w:tcMar>
+          </w:tcPr>
+          <w:p>
+            <w:r>
+              <w:rPr>
+                <w:sz w:val="19"/>
+              </w:rPr>
+              <w:t>§5.7's sync (blocking, read-write) + async (fire-and-forget, observation-only) method/constructor interception — SupervisionEvent, SyncSupervisionListener/AsyncSupervisionListener, @SyncSupervision/@AsyncSupervision</w:t>
             </w:r>
           </w:p>
         </w:tc>

</xml_diff>

<commit_message>
Refactor for module renaming and dependency graph cleanup, including documentation updates.
</commit_message>
<xml_diff>
--- a/doc/JAI_Whitepaper.docx
+++ b/doc/JAI_Whitepaper.docx
@@ -15650,15 +15650,7 @@
                 <w:color w:val="569CD6"/>
                 <w:sz w:val="19"/>
               </w:rPr>
-              <w:t xml:space="preserve">            throw</w:t>
-            </w:r>
-            <w:r>
-              <w:rPr>
-                <w:rFonts w:ascii="Consolas" w:hAnsi="Consolas"/>
-                <w:color w:val="569CD6"/>
-                <w:sz w:val="19"/>
-              </w:rPr>
-              <w:t xml:space="preserve"> new</w:t>
+              <w:t xml:space="preserve">            throw new</w:t>
             </w:r>
             <w:r>
               <w:rPr>
@@ -22804,7 +22796,7 @@
           <w:b w:val="0"/>
           <w:i w:val="0"/>
         </w:rPr>
-        <w:t>The mechanism that makes this possible without a compiler is the same one Hibernate already uses for dirty-checking (§4.3): ByteBuddy-based class weaving, applied either at class-load time via a -javaagent or at build time via a Maven/Gradle plugin for teams that prefer ahead-of-time weaving. Seven components, each independently a plain library:</w:t>
+        <w:t>The mechanism that makes this possible without a compiler is the same one Hibernate already uses for dirty-checking (§4.3): ByteBuddy-based class weaving, applied either at class-load time via a -javaagent or at build time via a Maven/Gradle plugin for teams that prefer ahead-of-time weaving. Eight components, each independently a plain library (Vector Core is realized by two of them — see the table below):</w:t>
       </w:r>
     </w:p>
     <w:tbl>
@@ -22965,7 +22957,7 @@
               <w:rPr>
                 <w:sz w:val="19"/>
               </w:rPr>
-              <w:t>javai-agent / javai-enhance</w:t>
+              <w:t>javai-substrate / javai-enhance</w:t>
             </w:r>
           </w:p>
         </w:tc>
@@ -23083,7 +23075,7 @@
               <w:rPr>
                 <w:sz w:val="19"/>
               </w:rPr>
-              <w:t>javai-runtime</w:t>
+              <w:t>javai-vector</w:t>
             </w:r>
           </w:p>
         </w:tc>
@@ -23121,7 +23113,7 @@
               <w:rPr>
                 <w:sz w:val="19"/>
               </w:rPr>
-              <w:t>EmbeddingVector; the cycle-safe back-edge propagation engine; the query() graph traversal; a CPU reference JavAISimilarityBackend (plain dot-product cosine similarity); a default JavAIEmbeddingProvider wrapping a small local embedding model, so built-in local embedding generation works out of the box</w:t>
+              <w:t>EmbeddingVector; a CPU reference JavAISimilarityBackend (plain dot-product cosine similarity); a default JavAIEmbeddingProvider wrapping a small local embedding model, so built-in local embedding generation works out of the box; dirty-state bookkeeping primitives</w:t>
             </w:r>
           </w:p>
         </w:tc>
@@ -23142,7 +23134,7 @@
               <w:rPr>
                 <w:sz w:val="19"/>
               </w:rPr>
-              <w:t>javai-collections</w:t>
+              <w:t>javai-model</w:t>
             </w:r>
           </w:p>
         </w:tc>
@@ -23161,7 +23153,66 @@
               <w:rPr>
                 <w:sz w:val="19"/>
               </w:rPr>
-              <w:t>Pure Java library, backed by javai-runtime's CPU similarity</w:t>
+              <w:t>Pure Java library, backed by javai-vector</w:t>
+            </w:r>
+          </w:p>
+        </w:tc>
+        <w:tc>
+          <w:tcPr>
+            <w:tcW w:type="dxa" w:w="4752"/>
+            <w:tcMar>
+              <w:top w:w="80" w:type="dxa"/>
+              <w:left w:w="80" w:type="dxa"/>
+              <w:bottom w:w="80" w:type="dxa"/>
+              <w:right w:w="80" w:type="dxa"/>
+            </w:tcMar>
+          </w:tcPr>
+          <w:p>
+            <w:r>
+              <w:rPr>
+                <w:sz w:val="19"/>
+              </w:rPr>
+              <w:t>JavAIVectorizable contract; the cycle-safe back-edge propagation engine; the query() graph traversal; JavAIList/JavAISet/JavAIMap and their concrete implementations; Contextable/PromptContext RAG-integration primitives — physically homed here (not javai-collections or javai-completion) for compile-order reasons, see doc/module-dependency-graph.md</w:t>
+            </w:r>
+          </w:p>
+        </w:tc>
+      </w:tr>
+      <w:tr>
+        <w:tc>
+          <w:tcPr>
+            <w:tcW w:type="dxa" w:w="2736"/>
+            <w:tcMar>
+              <w:top w:w="80" w:type="dxa"/>
+              <w:left w:w="80" w:type="dxa"/>
+              <w:bottom w:w="80" w:type="dxa"/>
+              <w:right w:w="80" w:type="dxa"/>
+            </w:tcMar>
+          </w:tcPr>
+          <w:p>
+            <w:r>
+              <w:rPr>
+                <w:sz w:val="19"/>
+              </w:rPr>
+              <w:t>javai-collections</w:t>
+            </w:r>
+          </w:p>
+        </w:tc>
+        <w:tc>
+          <w:tcPr>
+            <w:tcW w:type="dxa" w:w="4320"/>
+            <w:tcMar>
+              <w:top w:w="80" w:type="dxa"/>
+              <w:left w:w="80" w:type="dxa"/>
+              <w:bottom w:w="80" w:type="dxa"/>
+              <w:right w:w="80" w:type="dxa"/>
+            </w:tcMar>
+          </w:tcPr>
+          <w:p>
+            <w:r>
+              <w:rPr>
+                <w:sz w:val="19"/>
+              </w:rPr>
+              <w:t>Pure Java library, backed by javai-vector's CPU similarity and javai-model's JavAIVectorizable</w:t>
             </w:r>
           </w:p>
         </w:tc>

</xml_diff>

<commit_message>
First draft of tagging module
</commit_message>
<xml_diff>
--- a/doc/JAI_Whitepaper.docx
+++ b/doc/JAI_Whitepaper.docx
@@ -3269,7 +3269,7 @@
           <w:b w:val="0"/>
           <w:i w:val="0"/>
         </w:rPr>
-        <w:t>Everything JavAI adds to Java is organized into seven extension areas. Each is independently understandable, each is delivered as its own Phase 0 library component (§9.1), and — per §2.1's guiding philosophy — each is independently a candidate for upstream proposal if it earns that on its own merits. None of them retrofit sealed JDK classes (Object, java.util.Collection, etc.) from outside, which would require forking the JDK; every primitive is either synthesized into user classes by javaic/the weaver at build time, or shipped as a new, parallel type users opt into explicitly. The seven areas are not independent silos, though — §5.9 lays out how they depend on each other, and §5.10 sketches areas that didn't make this document's initial scope.</w:t>
+        <w:t>Everything JavAI adds to Java is organized into eight extension areas. Each is independently understandable, each is delivered as its own Phase 0 library component (§9.1), and — per §2.1's guiding philosophy — each is independently a candidate for upstream proposal if it earns that on its own merits. None of them retrofit sealed JDK classes (Object, java.util.Collection, etc.) from outside, which would require forking the JDK; every primitive is either synthesized into user classes by javaic/the weaver at build time, or shipped as a new, parallel type users opt into explicitly. The eight areas are not independent silos, though — §5.10 lays out how they depend on each other, and §5.11 sketches areas that didn't make this document's initial scope.</w:t>
       </w:r>
     </w:p>
     <w:p>
@@ -15898,7 +15898,7 @@
         <w:pStyle w:val="Heading2"/>
       </w:pPr>
       <w:r>
-        <w:t>5.8 Existing Projects: Depend On, Don't Fork</w:t>
+        <w:t>5.8 Tagging — Recursive, Vector-Backed Classification</w:t>
       </w:r>
     </w:p>
     <w:p>
@@ -15910,7 +15910,643 @@
           <w:b w:val="0"/>
           <w:i w:val="0"/>
         </w:rPr>
-        <w:t>A posture that cuts across all seven areas above, not one of them individually — Agentic Supervision (§5.7) follows it too, via ByteBuddy as an ordinary library dependency, its own independent installer rather than a fork of anything: consistent with the preference to avoid forking, none of the following are proposed for forking. Each is an ordinary library/build dependency:</w:t>
+        <w:t>Tagging lets any object -- @JavAIVectorizable or not -- carry zero or more Tags, where a Tag is itself a @JavAIVectorizable, recursively taggable object belonging to exactly one TagSet. @Taggable, @JavAIVectorizable, and @JavAIGraphNode are three independent, freely composable capabilities: a class can carry any subset of the three, including none. This single fact shapes the rest of the area. @Taggable is deliberately unwoven -- the same lightweight, hand-implemented-marker shape as @JavAIGraphNode (§5.4), not @JavAIVectorizable's full weave (§5.1) -- because tagging state lives in persisted association rows, not object fields, so there is nothing for a setter-rewriting weaver to intercept. And classification (deciding which tags apply to an object) has to be LLM-based rather than embedding-similarity-based as the default mechanism: a strategy that compares a tagged object's own vector() to each candidate tag's vector silently cannot work on any @Taggable object that isn't also @JavAIVectorizable, so it can't be the universal path.</w:t>
+      </w:r>
+    </w:p>
+    <w:p>
+      <w:pPr>
+        <w:spacing w:after="160"/>
+      </w:pPr>
+      <w:r>
+        <w:rPr>
+          <w:b w:val="0"/>
+          <w:i w:val="0"/>
+        </w:rPr>
+        <w:t>A Tag's vectorized identity is its slug, not its display text -- deliberately, since a Tag's localized display strings (a locale-to-string map, carried alongside the slug but never embedded) are meant to vary by audience while the tag's semantic identity stays fixed. The slug is derived once, at creation, by slugifying whichever localized string is entered first, and is immutable afterward; the one accepted limitation this creates is that a non-Latin-script first entry has no clean slugified form, and this area deliberately adds no transliteration or translation logic to solve it. A Tag belongs to exactly one TagSet -- a dynamic, persisted collection of Tags, not a compile-time enum of categories -- and a Tag's slug is unique within its own TagSet, not globally: two different TagSets may each mint a tag whose slug is urgent, since TagSets are independent taxonomies that shouldn't have to coordinate vocabulary. Because Tag is itself @Taggable, tags are recursively taggable -- the same cycle-safe walk §4.3/§5.1's summaryVector() already needs for a reference graph applies unchanged to a tag-on-tag graph.</w:t>
+      </w:r>
+    </w:p>
+    <w:p>
+      <w:pPr>
+        <w:spacing w:after="160"/>
+      </w:pPr>
+      <w:r>
+        <w:rPr>
+          <w:b w:val="0"/>
+          <w:i w:val="0"/>
+        </w:rPr>
+        <w:t>An object's association to a Tag is its own persisted row (Tag, taggable type, taggable id, optional affinity, source) -- not a field on either side. Affinity lives on this association, not on the Tag itself, since match strength is a property of one particular application, not of the tag; it is nullable and expected to be null for the common case, since tags are binary (“has it or doesn't”) by default. A given Tag has zero or one association to a given instance, enforced by a uniqueness constraint rather than application logic -- the only “duplicate” this area prevents by construction. Two different Tags in the same TagSet that mean nearly the same thing are not proscribed at the library level; that is a curation problem for whoever authors the TagSet, though it is a natural target for a similarity-based diagnostic test, since Tag already has a vector to compare against its own siblings.</w:t>
+      </w:r>
+    </w:p>
+    <w:p>
+      <w:pPr>
+        <w:spacing w:after="160"/>
+      </w:pPr>
+      <w:r>
+        <w:rPr>
+          <w:b w:val="0"/>
+          <w:i w:val="0"/>
+        </w:rPr>
+        <w:t>Classification is a Cortex call (§5.3), not a new inference mechanism: an object's @PromptContext fields (§5.3's own field-level allowlist for what an LLM sees, reused here rather than duplicated as a parallel annotation -- a new @TagIgnore exists only to exclude an otherwise-@PromptContext field from this specific prompt) are marshalled into text, combined with a TagSet's current candidate slugs, and sent to whichever provider Completion Fabric is configured against; the response is diffed against the instance's existing auto-sourced tags for that TagSet so a manually-applied tag is never disturbed by a later automated run. Classification is always client-invoked, never a side effect the library triggers automatically when a TagSet is edited -- adding or removing one tag from a set could otherwise fan out into an LLM call per already-tagged instance, a cost tradeoff that belongs to whoever owns it, not to a hidden default.</w:t>
+      </w:r>
+    </w:p>
+    <w:p>
+      <w:pPr>
+        <w:spacing w:after="160"/>
+      </w:pPr>
+      <w:r>
+        <w:rPr>
+          <w:b w:val="0"/>
+          <w:i w:val="0"/>
+        </w:rPr>
+        <w:t>The hardest requirement this area sets out to satisfy -- given a tag, or an ad hoc collection of tags, find other objects of any type whose own applied tags look similar -- resolves into an existing primitive rather than a new one. VectorIndex&lt;T&gt; (§5.4) is already exactly “a bare similarity-search container for cases that don't need full graph semantics”; this area needs only that, over a heterogeneous TaggableRef (a taggable type plus its UUID) instead of one entity type, maintained automatically as a side effect of applying or removing a tag rather than populated by hand. What it indexes is a new, persistence-only tag-summary vector per tagged instance -- a decay-weighted sum of every applied tag's own summaryVector(), each term further weighted by that association's affinity -- reusing §4.3's existing recursive formula, rooted at a set of tag associations instead of object-graph fields. Because combining already-cached tag vectors is pure arithmetic, not a new embedding call, this vector is recomputed eagerly on every change rather than lazily on next read, unlike every other lazily-recomputed vector this document specifies.</w:t>
+      </w:r>
+    </w:p>
+    <w:tbl>
+      <w:tblPr>
+        <w:tblW w:type="auto" w:w="0"/>
+        <w:jc w:val="center"/>
+        <w:tblLayout w:type="fixed"/>
+        <w:tblLook w:firstColumn="1" w:firstRow="1" w:lastColumn="0" w:lastRow="0" w:noHBand="0" w:noVBand="1" w:val="04A0"/>
+      </w:tblPr>
+      <w:tblGrid>
+        <w:gridCol w:w="2800"/>
+        <w:gridCol w:w="2200"/>
+        <w:gridCol w:w="4360"/>
+      </w:tblGrid>
+      <w:tr>
+        <w:tc>
+          <w:tcPr>
+            <w:tcW w:type="dxa" w:w="2800"/>
+            <w:shd w:val="clear" w:color="auto" w:fill="2E5C8A"/>
+            <w:tcMar>
+              <w:top w:w="80" w:type="dxa"/>
+              <w:left w:w="80" w:type="dxa"/>
+              <w:bottom w:w="80" w:type="dxa"/>
+              <w:right w:w="80" w:type="dxa"/>
+            </w:tcMar>
+          </w:tcPr>
+          <w:p>
+            <w:r/>
+            <w:r>
+              <w:rPr>
+                <w:b/>
+                <w:color w:val="FFFFFF"/>
+                <w:sz w:val="20"/>
+              </w:rPr>
+              <w:t>Element</w:t>
+            </w:r>
+          </w:p>
+        </w:tc>
+        <w:tc>
+          <w:tcPr>
+            <w:tcW w:type="dxa" w:w="2200"/>
+            <w:shd w:val="clear" w:color="auto" w:fill="2E5C8A"/>
+            <w:tcMar>
+              <w:top w:w="80" w:type="dxa"/>
+              <w:left w:w="80" w:type="dxa"/>
+              <w:bottom w:w="80" w:type="dxa"/>
+              <w:right w:w="80" w:type="dxa"/>
+            </w:tcMar>
+          </w:tcPr>
+          <w:p>
+            <w:r/>
+            <w:r>
+              <w:rPr>
+                <w:b/>
+                <w:color w:val="FFFFFF"/>
+                <w:sz w:val="20"/>
+              </w:rPr>
+              <w:t>Kind</w:t>
+            </w:r>
+          </w:p>
+        </w:tc>
+        <w:tc>
+          <w:tcPr>
+            <w:tcW w:type="dxa" w:w="4360"/>
+            <w:shd w:val="clear" w:color="auto" w:fill="2E5C8A"/>
+            <w:tcMar>
+              <w:top w:w="80" w:type="dxa"/>
+              <w:left w:w="80" w:type="dxa"/>
+              <w:bottom w:w="80" w:type="dxa"/>
+              <w:right w:w="80" w:type="dxa"/>
+            </w:tcMar>
+          </w:tcPr>
+          <w:p>
+            <w:r/>
+            <w:r>
+              <w:rPr>
+                <w:b/>
+                <w:color w:val="FFFFFF"/>
+                <w:sz w:val="20"/>
+              </w:rPr>
+              <w:t>Purpose</w:t>
+            </w:r>
+          </w:p>
+        </w:tc>
+      </w:tr>
+      <w:tr>
+        <w:tc>
+          <w:tcPr>
+            <w:tcW w:type="dxa" w:w="2800"/>
+            <w:tcMar>
+              <w:top w:w="80" w:type="dxa"/>
+              <w:left w:w="80" w:type="dxa"/>
+              <w:bottom w:w="80" w:type="dxa"/>
+              <w:right w:w="80" w:type="dxa"/>
+            </w:tcMar>
+          </w:tcPr>
+          <w:p>
+            <w:r>
+              <w:rPr>
+                <w:sz w:val="19"/>
+              </w:rPr>
+              <w:t>@Taggable</w:t>
+            </w:r>
+          </w:p>
+        </w:tc>
+        <w:tc>
+          <w:tcPr>
+            <w:tcW w:type="dxa" w:w="2200"/>
+            <w:tcMar>
+              <w:top w:w="80" w:type="dxa"/>
+              <w:left w:w="80" w:type="dxa"/>
+              <w:bottom w:w="80" w:type="dxa"/>
+              <w:right w:w="80" w:type="dxa"/>
+            </w:tcMar>
+          </w:tcPr>
+          <w:p>
+            <w:r>
+              <w:rPr>
+                <w:sz w:val="19"/>
+              </w:rPr>
+              <w:t>Annotation, class</w:t>
+            </w:r>
+          </w:p>
+        </w:tc>
+        <w:tc>
+          <w:tcPr>
+            <w:tcW w:type="dxa" w:w="4360"/>
+            <w:tcMar>
+              <w:top w:w="80" w:type="dxa"/>
+              <w:left w:w="80" w:type="dxa"/>
+              <w:bottom w:w="80" w:type="dxa"/>
+              <w:right w:w="80" w:type="dxa"/>
+            </w:tcMar>
+          </w:tcPr>
+          <w:p>
+            <w:r>
+              <w:rPr>
+                <w:sz w:val="19"/>
+              </w:rPr>
+              <w:t>Unwoven marker declaring tagging participation -- composable with @JavAIVectorizable/@JavAIGraphNode independently, the same shape as @JavAIGraphNode rather than a full weave</w:t>
+            </w:r>
+          </w:p>
+        </w:tc>
+      </w:tr>
+      <w:tr>
+        <w:tc>
+          <w:tcPr>
+            <w:tcW w:type="dxa" w:w="2800"/>
+            <w:tcMar>
+              <w:top w:w="80" w:type="dxa"/>
+              <w:left w:w="80" w:type="dxa"/>
+              <w:bottom w:w="80" w:type="dxa"/>
+              <w:right w:w="80" w:type="dxa"/>
+            </w:tcMar>
+          </w:tcPr>
+          <w:p>
+            <w:r>
+              <w:rPr>
+                <w:sz w:val="19"/>
+              </w:rPr>
+              <w:t>Taggable</w:t>
+            </w:r>
+          </w:p>
+        </w:tc>
+        <w:tc>
+          <w:tcPr>
+            <w:tcW w:type="dxa" w:w="2200"/>
+            <w:tcMar>
+              <w:top w:w="80" w:type="dxa"/>
+              <w:left w:w="80" w:type="dxa"/>
+              <w:bottom w:w="80" w:type="dxa"/>
+              <w:right w:w="80" w:type="dxa"/>
+            </w:tcMar>
+          </w:tcPr>
+          <w:p>
+            <w:r>
+              <w:rPr>
+                <w:sz w:val="19"/>
+              </w:rPr>
+              <w:t>Interface, hand-implemented</w:t>
+            </w:r>
+          </w:p>
+        </w:tc>
+        <w:tc>
+          <w:tcPr>
+            <w:tcW w:type="dxa" w:w="4360"/>
+            <w:tcMar>
+              <w:top w:w="80" w:type="dxa"/>
+              <w:left w:w="80" w:type="dxa"/>
+              <w:bottom w:w="80" w:type="dxa"/>
+              <w:right w:w="80" w:type="dxa"/>
+            </w:tcMar>
+          </w:tcPr>
+          <w:p>
+            <w:r>
+              <w:rPr>
+                <w:sz w:val="19"/>
+              </w:rPr>
+              <w:t>Empty marker bounding generic tagging APIs, mirroring &lt;N extends JavAIGraphNode&gt; on KnowledgeGraph</w:t>
+            </w:r>
+          </w:p>
+        </w:tc>
+      </w:tr>
+      <w:tr>
+        <w:tc>
+          <w:tcPr>
+            <w:tcW w:type="dxa" w:w="2800"/>
+            <w:tcMar>
+              <w:top w:w="80" w:type="dxa"/>
+              <w:left w:w="80" w:type="dxa"/>
+              <w:bottom w:w="80" w:type="dxa"/>
+              <w:right w:w="80" w:type="dxa"/>
+            </w:tcMar>
+          </w:tcPr>
+          <w:p>
+            <w:r>
+              <w:rPr>
+                <w:sz w:val="19"/>
+              </w:rPr>
+              <w:t>@TagIgnore</w:t>
+            </w:r>
+          </w:p>
+        </w:tc>
+        <w:tc>
+          <w:tcPr>
+            <w:tcW w:type="dxa" w:w="2200"/>
+            <w:tcMar>
+              <w:top w:w="80" w:type="dxa"/>
+              <w:left w:w="80" w:type="dxa"/>
+              <w:bottom w:w="80" w:type="dxa"/>
+              <w:right w:w="80" w:type="dxa"/>
+            </w:tcMar>
+          </w:tcPr>
+          <w:p>
+            <w:r>
+              <w:rPr>
+                <w:sz w:val="19"/>
+              </w:rPr>
+              <w:t>Annotation, field</w:t>
+            </w:r>
+          </w:p>
+        </w:tc>
+        <w:tc>
+          <w:tcPr>
+            <w:tcW w:type="dxa" w:w="4360"/>
+            <w:tcMar>
+              <w:top w:w="80" w:type="dxa"/>
+              <w:left w:w="80" w:type="dxa"/>
+              <w:bottom w:w="80" w:type="dxa"/>
+              <w:right w:w="80" w:type="dxa"/>
+            </w:tcMar>
+          </w:tcPr>
+          <w:p>
+            <w:r>
+              <w:rPr>
+                <w:sz w:val="19"/>
+              </w:rPr>
+              <w:t>Excludes an otherwise-@PromptContext field from the classification prompt specifically, without affecting what it renders for ordinary completions</w:t>
+            </w:r>
+          </w:p>
+        </w:tc>
+      </w:tr>
+      <w:tr>
+        <w:tc>
+          <w:tcPr>
+            <w:tcW w:type="dxa" w:w="2800"/>
+            <w:tcMar>
+              <w:top w:w="80" w:type="dxa"/>
+              <w:left w:w="80" w:type="dxa"/>
+              <w:bottom w:w="80" w:type="dxa"/>
+              <w:right w:w="80" w:type="dxa"/>
+            </w:tcMar>
+          </w:tcPr>
+          <w:p>
+            <w:r>
+              <w:rPr>
+                <w:sz w:val="19"/>
+              </w:rPr>
+              <w:t>Tag</w:t>
+            </w:r>
+          </w:p>
+        </w:tc>
+        <w:tc>
+          <w:tcPr>
+            <w:tcW w:type="dxa" w:w="2200"/>
+            <w:tcMar>
+              <w:top w:w="80" w:type="dxa"/>
+              <w:left w:w="80" w:type="dxa"/>
+              <w:bottom w:w="80" w:type="dxa"/>
+              <w:right w:w="80" w:type="dxa"/>
+            </w:tcMar>
+          </w:tcPr>
+          <w:p>
+            <w:r>
+              <w:rPr>
+                <w:sz w:val="19"/>
+              </w:rPr>
+              <w:t>Class (@JavAIVectorizable @Taggable)</w:t>
+            </w:r>
+          </w:p>
+        </w:tc>
+        <w:tc>
+          <w:tcPr>
+            <w:tcW w:type="dxa" w:w="4360"/>
+            <w:tcMar>
+              <w:top w:w="80" w:type="dxa"/>
+              <w:left w:w="80" w:type="dxa"/>
+              <w:bottom w:w="80" w:type="dxa"/>
+              <w:right w:w="80" w:type="dxa"/>
+            </w:tcMar>
+          </w:tcPr>
+          <w:p>
+            <w:r>
+              <w:rPr>
+                <w:sz w:val="19"/>
+              </w:rPr>
+              <w:t>Slug is the vectorized identity; localized display strings and an optional description are not vectorized; belongs to exactly one TagSet</w:t>
+            </w:r>
+          </w:p>
+        </w:tc>
+      </w:tr>
+      <w:tr>
+        <w:tc>
+          <w:tcPr>
+            <w:tcW w:type="dxa" w:w="2800"/>
+            <w:tcMar>
+              <w:top w:w="80" w:type="dxa"/>
+              <w:left w:w="80" w:type="dxa"/>
+              <w:bottom w:w="80" w:type="dxa"/>
+              <w:right w:w="80" w:type="dxa"/>
+            </w:tcMar>
+          </w:tcPr>
+          <w:p>
+            <w:r>
+              <w:rPr>
+                <w:sz w:val="19"/>
+              </w:rPr>
+              <w:t>TagSet</w:t>
+            </w:r>
+          </w:p>
+        </w:tc>
+        <w:tc>
+          <w:tcPr>
+            <w:tcW w:type="dxa" w:w="2200"/>
+            <w:tcMar>
+              <w:top w:w="80" w:type="dxa"/>
+              <w:left w:w="80" w:type="dxa"/>
+              <w:bottom w:w="80" w:type="dxa"/>
+              <w:right w:w="80" w:type="dxa"/>
+            </w:tcMar>
+          </w:tcPr>
+          <w:p>
+            <w:r>
+              <w:rPr>
+                <w:sz w:val="19"/>
+              </w:rPr>
+              <w:t>Class (@JavAIVectorizable)</w:t>
+            </w:r>
+          </w:p>
+        </w:tc>
+        <w:tc>
+          <w:tcPr>
+            <w:tcW w:type="dxa" w:w="4360"/>
+            <w:tcMar>
+              <w:top w:w="80" w:type="dxa"/>
+              <w:left w:w="80" w:type="dxa"/>
+              <w:bottom w:w="80" w:type="dxa"/>
+              <w:right w:w="80" w:type="dxa"/>
+            </w:tcMar>
+          </w:tcPr>
+          <w:p>
+            <w:r>
+              <w:rPr>
+                <w:sz w:val="19"/>
+              </w:rPr>
+              <w:t>A dynamic, persisted collection of Tags, not a compile-time enum -- its own summaryVector() aggregates its member tags for free</w:t>
+            </w:r>
+          </w:p>
+        </w:tc>
+      </w:tr>
+      <w:tr>
+        <w:tc>
+          <w:tcPr>
+            <w:tcW w:type="dxa" w:w="2800"/>
+            <w:tcMar>
+              <w:top w:w="80" w:type="dxa"/>
+              <w:left w:w="80" w:type="dxa"/>
+              <w:bottom w:w="80" w:type="dxa"/>
+              <w:right w:w="80" w:type="dxa"/>
+            </w:tcMar>
+          </w:tcPr>
+          <w:p>
+            <w:r>
+              <w:rPr>
+                <w:sz w:val="19"/>
+              </w:rPr>
+              <w:t>Tagging</w:t>
+            </w:r>
+          </w:p>
+        </w:tc>
+        <w:tc>
+          <w:tcPr>
+            <w:tcW w:type="dxa" w:w="2200"/>
+            <w:tcMar>
+              <w:top w:w="80" w:type="dxa"/>
+              <w:left w:w="80" w:type="dxa"/>
+              <w:bottom w:w="80" w:type="dxa"/>
+              <w:right w:w="80" w:type="dxa"/>
+            </w:tcMar>
+          </w:tcPr>
+          <w:p>
+            <w:r>
+              <w:rPr>
+                <w:sz w:val="19"/>
+              </w:rPr>
+              <w:t>Persisted association</w:t>
+            </w:r>
+          </w:p>
+        </w:tc>
+        <w:tc>
+          <w:tcPr>
+            <w:tcW w:type="dxa" w:w="4360"/>
+            <w:tcMar>
+              <w:top w:w="80" w:type="dxa"/>
+              <w:left w:w="80" w:type="dxa"/>
+              <w:bottom w:w="80" w:type="dxa"/>
+              <w:right w:w="80" w:type="dxa"/>
+            </w:tcMar>
+          </w:tcPr>
+          <w:p>
+            <w:r>
+              <w:rPr>
+                <w:sz w:val="19"/>
+              </w:rPr>
+              <w:t>Tag + taggable type/UUID + optional affinity + source (manual/auto) -- the join row, not a field on either side</w:t>
+            </w:r>
+          </w:p>
+        </w:tc>
+      </w:tr>
+      <w:tr>
+        <w:tc>
+          <w:tcPr>
+            <w:tcW w:type="dxa" w:w="2800"/>
+            <w:tcMar>
+              <w:top w:w="80" w:type="dxa"/>
+              <w:left w:w="80" w:type="dxa"/>
+              <w:bottom w:w="80" w:type="dxa"/>
+              <w:right w:w="80" w:type="dxa"/>
+            </w:tcMar>
+          </w:tcPr>
+          <w:p>
+            <w:r>
+              <w:rPr>
+                <w:sz w:val="19"/>
+              </w:rPr>
+              <w:t>JavAITagging</w:t>
+            </w:r>
+          </w:p>
+        </w:tc>
+        <w:tc>
+          <w:tcPr>
+            <w:tcW w:type="dxa" w:w="2200"/>
+            <w:tcMar>
+              <w:top w:w="80" w:type="dxa"/>
+              <w:left w:w="80" w:type="dxa"/>
+              <w:bottom w:w="80" w:type="dxa"/>
+              <w:right w:w="80" w:type="dxa"/>
+            </w:tcMar>
+          </w:tcPr>
+          <w:p>
+            <w:r>
+              <w:rPr>
+                <w:sz w:val="19"/>
+              </w:rPr>
+              <w:t>Static facade</w:t>
+            </w:r>
+          </w:p>
+        </w:tc>
+        <w:tc>
+          <w:tcPr>
+            <w:tcW w:type="dxa" w:w="4360"/>
+            <w:tcMar>
+              <w:top w:w="80" w:type="dxa"/>
+              <w:left w:w="80" w:type="dxa"/>
+              <w:bottom w:w="80" w:type="dxa"/>
+              <w:right w:w="80" w:type="dxa"/>
+            </w:tcMar>
+          </w:tcPr>
+          <w:p>
+            <w:r>
+              <w:rPr>
+                <w:sz w:val="19"/>
+              </w:rPr>
+              <w:t>addTag/removeTag/hasTag/tagsOf/taggedWith, classification entry points, and tag-similarity index access -- this area's JavAIPI</w:t>
+            </w:r>
+          </w:p>
+        </w:tc>
+      </w:tr>
+      <w:tr>
+        <w:tc>
+          <w:tcPr>
+            <w:tcW w:type="dxa" w:w="2800"/>
+            <w:tcMar>
+              <w:top w:w="80" w:type="dxa"/>
+              <w:left w:w="80" w:type="dxa"/>
+              <w:bottom w:w="80" w:type="dxa"/>
+              <w:right w:w="80" w:type="dxa"/>
+            </w:tcMar>
+          </w:tcPr>
+          <w:p>
+            <w:r>
+              <w:rPr>
+                <w:sz w:val="19"/>
+              </w:rPr>
+              <w:t>TaggableRef</w:t>
+            </w:r>
+          </w:p>
+        </w:tc>
+        <w:tc>
+          <w:tcPr>
+            <w:tcW w:type="dxa" w:w="2200"/>
+            <w:tcMar>
+              <w:top w:w="80" w:type="dxa"/>
+              <w:left w:w="80" w:type="dxa"/>
+              <w:bottom w:w="80" w:type="dxa"/>
+              <w:right w:w="80" w:type="dxa"/>
+            </w:tcMar>
+          </w:tcPr>
+          <w:p>
+            <w:r>
+              <w:rPr>
+                <w:sz w:val="19"/>
+              </w:rPr>
+              <w:t>Value type</w:t>
+            </w:r>
+          </w:p>
+        </w:tc>
+        <w:tc>
+          <w:tcPr>
+            <w:tcW w:type="dxa" w:w="4360"/>
+            <w:tcMar>
+              <w:top w:w="80" w:type="dxa"/>
+              <w:left w:w="80" w:type="dxa"/>
+              <w:bottom w:w="80" w:type="dxa"/>
+              <w:right w:w="80" w:type="dxa"/>
+            </w:tcMar>
+          </w:tcPr>
+          <w:p>
+            <w:r>
+              <w:rPr>
+                <w:sz w:val="19"/>
+              </w:rPr>
+              <w:t>(taggableType, taggableId) -- the heterogeneous handle used by both structural and similarity queries</w:t>
+            </w:r>
+          </w:p>
+        </w:tc>
+      </w:tr>
+    </w:tbl>
+    <w:p>
+      <w:pPr>
+        <w:spacing w:after="160"/>
+      </w:pPr>
+      <w:r>
+        <w:rPr>
+          <w:b w:val="0"/>
+          <w:i w:val="0"/>
+        </w:rPr>
+        <w:t>Relationship to the rest of this document: Tagging is the one area that depends on three others directly -- Vector Core, Persistence Bridge, and Completion Fabric -- rather than feeding into them, and is built last as a result (§9.1). It composes with Vector Collections' KnowledgeGraph (§5.4) where an object happens to be both @Taggable and @JavAIGraphNode, surfacing tag associations as edges for structural traversal alongside similarity, but takes no hard dependency on it: Taggable is a universal concern, not a KnowledgeGraph specialization. Full primitive-level detail: doc/spec/tagging.md.</w:t>
+      </w:r>
+    </w:p>
+    <w:p>
+      <w:pPr>
+        <w:pStyle w:val="Heading2"/>
+      </w:pPr>
+      <w:r>
+        <w:t>5.9 Existing Projects: Depend On, Don't Fork</w:t>
+      </w:r>
+    </w:p>
+    <w:p>
+      <w:pPr>
+        <w:spacing w:after="160"/>
+      </w:pPr>
+      <w:r>
+        <w:rPr>
+          <w:b w:val="0"/>
+          <w:i w:val="0"/>
+        </w:rPr>
+        <w:t>A posture that cuts across all eight areas above, not one of them individually — Agentic Supervision (§5.7) follows it too, via ByteBuddy as an ordinary library dependency, its own independent installer rather than a fork of anything: consistent with the preference to avoid forking, none of the following are proposed for forking. Each is an ordinary library/build dependency:</w:t>
       </w:r>
     </w:p>
     <w:tbl>
@@ -16297,7 +16933,7 @@
         <w:pStyle w:val="Heading2"/>
       </w:pPr>
       <w:r>
-        <w:t>5.9 Cross-Dependencies Between Extension Areas</w:t>
+        <w:t>5.10 Cross-Dependencies Between Extension Areas</w:t>
       </w:r>
     </w:p>
     <w:p>
@@ -16309,7 +16945,7 @@
           <w:b w:val="0"/>
           <w:i w:val="0"/>
         </w:rPr>
-        <w:t>The first six areas above are not six independent bets — most of them only make sense because another area exists underneath them. Acceleration Substrate (§5.6) is the foundation: it's the compiler/weaver that actually implements Vector Core's interface and Vector Collections' graph types, and the mechanism that turns Codegen Guidance's annotations into enforced behavior rather than inert metadata. Vector Core (§5.1) is the next layer up: Vector Collections (§5.4) calls straight into its EmbeddingVector and similarityTo() primitives to implement cosine-distance sorting and graph-node similarity, and Persistence Bridge (§5.2) has nothing to persist without it. Vector Collections, in turn, is what Persistence Bridge actually maps onto a store (a KnowledgeGraph or JavAIList is the thing a repository query returns) and what Completion Fabric (§5.3) consumes directly through toContext() — which is why Completion Fabric depends on Vector Collections one hop before it depends on Vector Core at all. Codegen Guidance (§5.5) is the one area that mostly doesn't feed forward into the others: it's consumed by Acceleration Substrate's compiler/weaver, and — per §5.10 — is the most likely foundation for a future agent-orchestration extension distinct from §5.7 Agentic Supervision (that candidate is about exposing methods AS callable tools; §5.7 is about intercepting calls that already happen) — but nothing in §5.1–§5.4 depends on it.</w:t>
+        <w:t>The first six areas above are not six independent bets — most of them only make sense because another area exists underneath them. Acceleration Substrate (§5.6) is the foundation: it's the compiler/weaver that actually implements Vector Core's interface and Vector Collections' graph types, and the mechanism that turns Codegen Guidance's annotations into enforced behavior rather than inert metadata. Vector Core (§5.1) is the next layer up: Vector Collections (§5.4) calls straight into its EmbeddingVector and similarityTo() primitives to implement cosine-distance sorting and graph-node similarity, and Persistence Bridge (§5.2) has nothing to persist without it. Vector Collections, in turn, is what Persistence Bridge actually maps onto a store (a KnowledgeGraph or JavAIList is the thing a repository query returns) and what Completion Fabric (§5.3) consumes directly through toContext() — which is why Completion Fabric depends on Vector Collections one hop before it depends on Vector Core at all. Codegen Guidance (§5.5) is the one area that mostly doesn't feed forward into the others: it's consumed by Acceleration Substrate's compiler/weaver, and — per §5.11 — is the most likely foundation for a future agent-orchestration extension distinct from §5.7 Agentic Supervision (that candidate is about exposing methods AS callable tools; §5.7 is about intercepting calls that already happen) — but nothing in §5.1–§5.4 depends on it.</w:t>
       </w:r>
     </w:p>
     <w:p>
@@ -16361,7 +16997,7 @@
           <w:color w:val="555555"/>
           <w:sz w:val="19"/>
         </w:rPr>
-        <w:t>Figure 5. Layered dependency structure across the first six extension areas — arrows read as “required by.” Agentic Supervision (§5.7, added after this figure was drawn) is deliberately not pictured here: it depends only on §5.5's annotation vocabulary via javai-annotations, not on Acceleration Substrate's weaver, and nothing above depends on it. See SPEC.md's text-form dependency diagram for the current, seven-area picture.</w:t>
+        <w:t>Figure 5. Layered dependency structure across the first six extension areas — arrows read as “required by.” Agentic Supervision (§5.7, added after this figure was drawn) is deliberately not pictured here: it depends only on §5.5's annotation vocabulary via javai-annotations, not on Acceleration Substrate's weaver, and nothing above depends on it. See SPEC.md's text-form dependency diagram for the current, eight-area picture.</w:t>
       </w:r>
     </w:p>
     <w:p>
@@ -16381,7 +17017,7 @@
         <w:pStyle w:val="Heading2"/>
       </w:pPr>
       <w:r>
-        <w:t>5.10 Additional Possible Future Extension Areas</w:t>
+        <w:t>5.11 Additional Possible Future Extension Areas</w:t>
       </w:r>
     </w:p>
     <w:p>
@@ -22796,7 +23432,7 @@
           <w:b w:val="0"/>
           <w:i w:val="0"/>
         </w:rPr>
-        <w:t>The mechanism that makes this possible without a compiler is the same one Hibernate already uses for dirty-checking (§4.3): ByteBuddy-based class weaving, applied either at class-load time via a -javaagent or at build time via a Maven/Gradle plugin for teams that prefer ahead-of-time weaving. Eight components, each independently a plain library (Vector Core is realized by two of them — see the table below):</w:t>
+        <w:t>The mechanism that makes this possible without a compiler is the same one Hibernate already uses for dirty-checking (§4.3): ByteBuddy-based class weaving, applied either at class-load time via a -javaagent or at build time via a Maven/Gradle plugin for teams that prefer ahead-of-time weaving. Nine components, each independently a plain library (Vector Core is realized by two of them — see the table below):</w:t>
       </w:r>
     </w:p>
     <w:tbl>
@@ -23350,6 +23986,65 @@
                 <w:sz w:val="19"/>
               </w:rPr>
               <w:t>The complete §7 Completion/RAG API: PromptContext, CompletionRequest/Result, subgraph .toContext() serialization, virtual-thread-backed complete()/completeStreaming() — no GPU or invokedynamic dependency at all</w:t>
+            </w:r>
+          </w:p>
+        </w:tc>
+      </w:tr>
+      <w:tr>
+        <w:tc>
+          <w:tcPr>
+            <w:tcW w:type="dxa" w:w="2736"/>
+            <w:tcMar>
+              <w:top w:w="80" w:type="dxa"/>
+              <w:left w:w="80" w:type="dxa"/>
+              <w:bottom w:w="80" w:type="dxa"/>
+              <w:right w:w="80" w:type="dxa"/>
+            </w:tcMar>
+          </w:tcPr>
+          <w:p>
+            <w:r>
+              <w:rPr>
+                <w:sz w:val="19"/>
+              </w:rPr>
+              <w:t>javai-tagging</w:t>
+            </w:r>
+          </w:p>
+        </w:tc>
+        <w:tc>
+          <w:tcPr>
+            <w:tcW w:type="dxa" w:w="4320"/>
+            <w:tcMar>
+              <w:top w:w="80" w:type="dxa"/>
+              <w:left w:w="80" w:type="dxa"/>
+              <w:bottom w:w="80" w:type="dxa"/>
+              <w:right w:w="80" w:type="dxa"/>
+            </w:tcMar>
+          </w:tcPr>
+          <w:p>
+            <w:r>
+              <w:rPr>
+                <w:sz w:val="19"/>
+              </w:rPr>
+              <w:t>Pure Java library, backed by javai-vector/javai-model/javai-collections/javai-persistence/javai-completion; also weaves its own shipped Tag/TagSet at build time via javai-substrate (see doc/spec/tagging.md)</w:t>
+            </w:r>
+          </w:p>
+        </w:tc>
+        <w:tc>
+          <w:tcPr>
+            <w:tcW w:type="dxa" w:w="4752"/>
+            <w:tcMar>
+              <w:top w:w="80" w:type="dxa"/>
+              <w:left w:w="80" w:type="dxa"/>
+              <w:bottom w:w="80" w:type="dxa"/>
+              <w:right w:w="80" w:type="dxa"/>
+            </w:tcMar>
+          </w:tcPr>
+          <w:p>
+            <w:r>
+              <w:rPr>
+                <w:sz w:val="19"/>
+              </w:rPr>
+              <w:t>@Taggable/@TagIgnore; Tag/TagSet/Tagging; LLM-based classification via JavAITagging; tag-similarity search as a persisted VectorIndex&lt;TaggableRef&gt;</w:t>
             </w:r>
           </w:p>
         </w:tc>

</xml_diff>